<commit_message>
Add PiN parameters step 1 hybrid for Somalia___SOM
</commit_message>
<xml_diff>
--- a/platform_PiN_output/Somalia___SOM/Param_step1_Somalia___SOM_1008_02AM.docx
+++ b/platform_PiN_output/Somalia___SOM/Param_step1_Somalia___SOM_1008_02AM.docx
@@ -31,7 +31,7 @@
         <w:pStyle w:val="ListBullet"/>
       </w:pPr>
       <w:r>
-        <w:t>Date calculation: 08/10/2026 02:17</w:t>
+        <w:t>Date calculation: 08/10/2026 02:55</w:t>
       </w:r>
     </w:p>
     <w:p>
@@ -220,6 +220,15 @@
       <w:r>
         <w:t xml:space="preserve">In-school children whose education was disrupted due to </w:t>
       </w:r>
+      <w:r>
+        <w:rPr>
+          <w:b/>
+        </w:rPr>
+        <w:t>edu_disrupted_attack</w:t>
+      </w:r>
+      <w:r>
+        <w:t>.</w:t>
+      </w:r>
     </w:p>
     <w:p>
       <w:pPr>
@@ -251,6 +260,14 @@
       </w:pPr>
       <w:r>
         <w:t xml:space="preserve">      There is a ban preventing the child from attending</w:t>
+      </w:r>
+    </w:p>
+    <w:p>
+      <w:pPr>
+        <w:pStyle w:val="ListBullet2"/>
+      </w:pPr>
+      <w:r>
+        <w:t xml:space="preserve">      Discrimination or stigmatization of the child</w:t>
       </w:r>
     </w:p>
     <w:p>
@@ -290,7 +307,7 @@
         <w:pStyle w:val="ListBullet"/>
       </w:pPr>
       <w:r>
-        <w:t>Age Ranges: [13, 0]</w:t>
+        <w:t>Age Ranges: [14, 0]</w:t>
       </w:r>
     </w:p>
     <w:sectPr>

</xml_diff>